<commit_message>
feat: add ACC lab5 reports
</commit_message>
<xml_diff>
--- a/ACC/lab4/P3432 Ястребов-Амирханов_Алекси Исупов_Никита_Александрович ЛР5.docx
+++ b/ACC/lab4/P3432 Ястребов-Амирханов_Алекси Исупов_Никита_Александрович ЛР5.docx
@@ -417,7 +417,7 @@
           <w:szCs w:val="32"/>
           <w:lang w:val="ru-RU"/>
         </w:rPr>
-        <w:t>4</w:t>
+        <w:t>5</w:t>
       </w:r>
       <w:r>
         <w:rPr>
@@ -440,29 +440,7 @@
           <w:szCs w:val="32"/>
           <w:lang w:val="ru-RU"/>
         </w:rPr>
-        <w:t>Настройка локального</w:t>
-      </w:r>
-      <w:r>
-        <w:rPr>
-          <w:rFonts w:ascii="Times New Roman" w:eastAsia="Times New Roman" w:hAnsi="Times New Roman" w:cs="Times New Roman"/>
-          <w:b/>
-          <w:bCs/>
-          <w:sz w:val="32"/>
-          <w:szCs w:val="32"/>
-          <w:lang w:val="ru-RU"/>
-        </w:rPr>
-        <w:t xml:space="preserve"> </w:t>
-      </w:r>
-      <w:r>
-        <w:rPr>
-          <w:rFonts w:ascii="Times New Roman" w:eastAsia="Times New Roman" w:hAnsi="Times New Roman" w:cs="Times New Roman"/>
-          <w:b/>
-          <w:bCs/>
-          <w:sz w:val="32"/>
-          <w:szCs w:val="32"/>
-          <w:lang w:val="ru-RU"/>
-        </w:rPr>
-        <w:t>механизма AAA</w:t>
+        <w:t>Настройка FTP</w:t>
       </w:r>
       <w:r>
         <w:rPr>
@@ -1912,25 +1890,7 @@
           <w:szCs w:val="24"/>
           <w:lang w:val="ru-RU"/>
         </w:rPr>
-        <w:t>Лабораторная работа помогает получить практические навыки по изучению</w:t>
-      </w:r>
-      <w:r>
-        <w:rPr>
-          <w:rFonts w:ascii="Times New Roman" w:eastAsia="Times New Roman" w:hAnsi="Times New Roman" w:cs="Times New Roman"/>
-          <w:sz w:val="24"/>
-          <w:szCs w:val="24"/>
-          <w:lang w:val="ru-RU"/>
-        </w:rPr>
-        <w:t xml:space="preserve"> </w:t>
-      </w:r>
-      <w:r>
-        <w:rPr>
-          <w:rFonts w:ascii="Times New Roman" w:eastAsia="Times New Roman" w:hAnsi="Times New Roman" w:cs="Times New Roman"/>
-          <w:sz w:val="24"/>
-          <w:szCs w:val="24"/>
-          <w:lang w:val="ru-RU"/>
-        </w:rPr>
-        <w:t>следующих тем:</w:t>
+        <w:t>Лабораторная работа помогает получить практические навыки по изучению следующих тем:</w:t>
       </w:r>
     </w:p>
     <w:p>
@@ -1983,7 +1943,7 @@
           <w:rFonts w:ascii="Times New Roman" w:eastAsia="Times New Roman" w:hAnsi="Times New Roman" w:cs="Times New Roman"/>
           <w:sz w:val="24"/>
           <w:szCs w:val="24"/>
-          <w:lang w:val="en-US"/>
+          <w:lang w:val="ru-RU"/>
         </w:rPr>
       </w:pPr>
       <w:r>
@@ -2004,7 +1964,7 @@
           <w:sz w:val="24"/>
           <w:szCs w:val="24"/>
           <w:highlight w:val="white"/>
-          <w:lang w:val="en-US"/>
+          <w:lang w:val="ru-RU"/>
         </w:rPr>
       </w:pPr>
     </w:p>
@@ -2049,6 +2009,7 @@
       </w:pPr>
       <w:r>
         <w:rPr>
+          <w:noProof/>
           <w:lang w:val="en-US"/>
         </w:rPr>
         <w:drawing>
@@ -2177,7 +2138,7 @@
           <w:color w:val="auto"/>
           <w:sz w:val="36"/>
           <w:szCs w:val="36"/>
-          <w:lang w:val="en-US"/>
+          <w:lang w:val="ru-RU"/>
         </w:rPr>
       </w:pPr>
       <w:bookmarkStart w:id="3" w:name="_Toc241756816"/>
@@ -3361,7 +3322,7 @@
           <w:rFonts w:ascii="Times New Roman" w:hAnsi="Times New Roman" w:cs="Times New Roman"/>
           <w:sz w:val="24"/>
           <w:szCs w:val="24"/>
-          <w:lang w:val="en-US"/>
+          <w:lang w:val="ru-RU"/>
         </w:rPr>
       </w:pPr>
       <w:r>
@@ -11940,6 +11901,7 @@
   <w:style w:type="character" w:default="1" w:styleId="a0">
     <w:name w:val="Default Paragraph Font"/>
     <w:uiPriority w:val="1"/>
+    <w:semiHidden/>
     <w:unhideWhenUsed/>
   </w:style>
   <w:style w:type="table" w:default="1" w:styleId="a1">
@@ -12833,28 +12795,28 @@
 </file>
 
 <file path=customXml/item1.xml><?xml version="1.0" encoding="utf-8"?>
-<b:Sources xmlns:b="http://schemas.openxmlformats.org/officeDocument/2006/bibliography" xmlns="http://schemas.openxmlformats.org/officeDocument/2006/bibliography" SelectedStyle="\APASixthEditionOfficeOnline.xsl" StyleName="APA" Version="6"/>
-</file>
-
-<file path=customXml/item2.xml><?xml version="1.0" encoding="utf-8"?>
 <go:gDocsCustomXmlDataStorage xmlns:go="http://customooxmlschemas.google.com/" xmlns:r="http://schemas.openxmlformats.org/officeDocument/2006/relationships" uri="GoogleDocsCustomDataVersion2">
   <go:docsCustomData xmlns:go="http://customooxmlschemas.google.com/" roundtripDataSignature="AMtx7mjwruTx+Vn/MDAX/44QgQzc+AP2Ag==">CgMxLjAaHwoBMBIaChgICVIUChJ0YWJsZS44OTd0NXlmdTg0cWQaHwoBMRIaChgICVIUChJ0YWJsZS5kczg1cWF0bWl6dm4yDmguMWR4YmM5MTJqNXNhMg5oLnR1aDlyZ2JhaGY0ZDIOaC5nM3g0NWQ4ZmVpZWk4AHIhMUNmRUxpcVc2YnEwSHB1aWZkcDJZSzFENklNNzV4Q3k3</go:docsCustomData>
 </go:gDocsCustomXmlDataStorage>
 </file>
 
-<file path=customXml/itemProps1.xml><?xml version="1.0" encoding="utf-8"?>
-<ds:datastoreItem xmlns:ds="http://schemas.openxmlformats.org/officeDocument/2006/customXml" ds:itemID="{34F984A3-66A3-43B7-A0AA-61F4BAE2E3FF}">
-  <ds:schemaRefs>
-    <ds:schemaRef ds:uri="http://schemas.openxmlformats.org/officeDocument/2006/bibliography"/>
-  </ds:schemaRefs>
-</ds:datastoreItem>
+<file path=customXml/item2.xml><?xml version="1.0" encoding="utf-8"?>
+<b:Sources xmlns:b="http://schemas.openxmlformats.org/officeDocument/2006/bibliography" xmlns="http://schemas.openxmlformats.org/officeDocument/2006/bibliography" SelectedStyle="\APASixthEditionOfficeOnline.xsl" StyleName="APA" Version="6"/>
 </file>
 
-<file path=customXml/itemProps2.xml><?xml version="1.0" encoding="utf-8"?>
+<file path=customXml/itemProps1.xml><?xml version="1.0" encoding="utf-8"?>
 <ds:datastoreItem xmlns:ds="http://schemas.openxmlformats.org/officeDocument/2006/customXml" ds:itemID="{11111111-1234-1234-1234-123412341234}">
   <ds:schemaRefs>
     <ds:schemaRef ds:uri="http://customooxmlschemas.google.com/"/>
     <ds:schemaRef ds:uri="http://schemas.openxmlformats.org/officeDocument/2006/relationships"/>
   </ds:schemaRefs>
 </ds:datastoreItem>
+</file>
+
+<file path=customXml/itemProps2.xml><?xml version="1.0" encoding="utf-8"?>
+<ds:datastoreItem xmlns:ds="http://schemas.openxmlformats.org/officeDocument/2006/customXml" ds:itemID="{34F984A3-66A3-43B7-A0AA-61F4BAE2E3FF}">
+  <ds:schemaRefs>
+    <ds:schemaRef ds:uri="http://schemas.openxmlformats.org/officeDocument/2006/bibliography"/>
+  </ds:schemaRefs>
+</ds:datastoreItem>
 </file>
</xml_diff>